<commit_message>
New RM files, updated manuals, fixed small bug in moving average
</commit_message>
<xml_diff>
--- a/Manual/Short ICP-Base Manual.docx
+++ b/Manual/Short ICP-Base Manual.docx
@@ -749,7 +749,21 @@
         <w:rPr>
           <w:lang w:val="en-US"/>
         </w:rPr>
-        <w:t xml:space="preserve"> etc)</w:t>
+        <w:t xml:space="preserve"> </w:t>
+      </w:r>
+      <w:proofErr w:type="spellStart"/>
+      <w:r>
+        <w:rPr>
+          <w:lang w:val="en-US"/>
+        </w:rPr>
+        <w:t>etc</w:t>
+      </w:r>
+      <w:proofErr w:type="spellEnd"/>
+      <w:r>
+        <w:rPr>
+          <w:lang w:val="en-US"/>
+        </w:rPr>
+        <w:t>)</w:t>
       </w:r>
     </w:p>
     <w:p>
@@ -1114,7 +1128,21 @@
         <w:rPr>
           <w:lang w:val="en-US"/>
         </w:rPr>
-        <w:t xml:space="preserve">and Nexion .csv </w:t>
+        <w:t xml:space="preserve">and </w:t>
+      </w:r>
+      <w:proofErr w:type="spellStart"/>
+      <w:r>
+        <w:rPr>
+          <w:lang w:val="en-US"/>
+        </w:rPr>
+        <w:t>Nexion</w:t>
+      </w:r>
+      <w:proofErr w:type="spellEnd"/>
+      <w:r>
+        <w:rPr>
+          <w:lang w:val="en-US"/>
+        </w:rPr>
+        <w:t xml:space="preserve"> .csv </w:t>
       </w:r>
       <w:r>
         <w:rPr>
@@ -1557,7 +1585,21 @@
         <w:rPr>
           <w:lang w:val="en-US"/>
         </w:rPr>
-        <w:t>Thermo Fisher iCAP they are already imported with the signal data.</w:t>
+        <w:t xml:space="preserve">Thermo Fisher </w:t>
+      </w:r>
+      <w:proofErr w:type="spellStart"/>
+      <w:r>
+        <w:rPr>
+          <w:lang w:val="en-US"/>
+        </w:rPr>
+        <w:t>iCAP</w:t>
+      </w:r>
+      <w:proofErr w:type="spellEnd"/>
+      <w:r>
+        <w:rPr>
+          <w:lang w:val="en-US"/>
+        </w:rPr>
+        <w:t xml:space="preserve"> they are already imported with the signal data.</w:t>
       </w:r>
     </w:p>
     <w:p>
@@ -1588,8 +1630,16 @@
         <w:rPr>
           <w:lang w:val="en-US"/>
         </w:rPr>
-        <w:t>times are imported, ICP-Base assumes 10 ms</w:t>
-      </w:r>
+        <w:t xml:space="preserve">times are imported, ICP-Base assumes 10 </w:t>
+      </w:r>
+      <w:proofErr w:type="spellStart"/>
+      <w:r>
+        <w:rPr>
+          <w:lang w:val="en-US"/>
+        </w:rPr>
+        <w:t>ms</w:t>
+      </w:r>
+      <w:proofErr w:type="spellEnd"/>
     </w:p>
     <w:p>
       <w:pPr>
@@ -1664,7 +1714,21 @@
         <w:rPr>
           <w:lang w:val="en-US"/>
         </w:rPr>
-        <w:t xml:space="preserve">Thermo Fisher iCAP </w:t>
+        <w:t xml:space="preserve">Thermo Fisher </w:t>
+      </w:r>
+      <w:proofErr w:type="spellStart"/>
+      <w:r>
+        <w:rPr>
+          <w:lang w:val="en-US"/>
+        </w:rPr>
+        <w:t>iCAP</w:t>
+      </w:r>
+      <w:proofErr w:type="spellEnd"/>
+      <w:r>
+        <w:rPr>
+          <w:lang w:val="en-US"/>
+        </w:rPr>
+        <w:t xml:space="preserve"> </w:t>
       </w:r>
       <w:r>
         <w:rPr>
@@ -3292,13 +3356,41 @@
         <w:rPr>
           <w:lang w:val="en-US"/>
         </w:rPr>
-        <w:t>Their compositions are stored in files in the subfolder RM_Files in the ICP-Base folder</w:t>
-      </w:r>
-      <w:r>
-        <w:rPr>
-          <w:lang w:val="en-US"/>
-        </w:rPr>
-        <w:t xml:space="preserve"> or in a custom set filepath (changed via the settings menu).</w:t>
+        <w:t xml:space="preserve">Their compositions are stored in files in the subfolder </w:t>
+      </w:r>
+      <w:proofErr w:type="spellStart"/>
+      <w:r>
+        <w:rPr>
+          <w:lang w:val="en-US"/>
+        </w:rPr>
+        <w:t>RM_Files</w:t>
+      </w:r>
+      <w:proofErr w:type="spellEnd"/>
+      <w:r>
+        <w:rPr>
+          <w:lang w:val="en-US"/>
+        </w:rPr>
+        <w:t xml:space="preserve"> in the ICP-Base folder</w:t>
+      </w:r>
+      <w:r>
+        <w:rPr>
+          <w:lang w:val="en-US"/>
+        </w:rPr>
+        <w:t xml:space="preserve"> or in a custom set </w:t>
+      </w:r>
+      <w:proofErr w:type="spellStart"/>
+      <w:r>
+        <w:rPr>
+          <w:lang w:val="en-US"/>
+        </w:rPr>
+        <w:t>filepath</w:t>
+      </w:r>
+      <w:proofErr w:type="spellEnd"/>
+      <w:r>
+        <w:rPr>
+          <w:lang w:val="en-US"/>
+        </w:rPr>
+        <w:t xml:space="preserve"> (changed via the settings menu).</w:t>
       </w:r>
     </w:p>
     <w:p>
@@ -3436,11 +3528,52 @@
     </w:p>
     <w:p>
       <w:pPr>
-        <w:rPr>
-          <w:lang w:val="en-US"/>
-        </w:rPr>
-      </w:pPr>
-    </w:p>
+        <w:pStyle w:val="ListParagraph"/>
+        <w:numPr>
+          <w:ilvl w:val="0"/>
+          <w:numId w:val="9"/>
+        </w:numPr>
+        <w:jc w:val="both"/>
+        <w:rPr>
+          <w:b/>
+          <w:bCs/>
+          <w:sz w:val="20"/>
+          <w:szCs w:val="20"/>
+          <w:lang w:val="en-US"/>
+        </w:rPr>
+      </w:pPr>
+      <w:r>
+        <w:rPr>
+          <w:b/>
+          <w:bCs/>
+          <w:sz w:val="20"/>
+          <w:szCs w:val="20"/>
+          <w:lang w:val="en-US"/>
+        </w:rPr>
+        <w:t>If you want to change the RM files/values and you use a compiled version you have to change the reference material folder</w:t>
+      </w:r>
+      <w:r>
+        <w:rPr>
+          <w:b/>
+          <w:bCs/>
+          <w:sz w:val="20"/>
+          <w:szCs w:val="20"/>
+          <w:lang w:val="en-US"/>
+        </w:rPr>
+        <w:t xml:space="preserve"> (Settings Menu)</w:t>
+      </w:r>
+      <w:r>
+        <w:rPr>
+          <w:b/>
+          <w:bCs/>
+          <w:sz w:val="20"/>
+          <w:szCs w:val="20"/>
+          <w:lang w:val="en-US"/>
+        </w:rPr>
+        <w:t>. The compiled version has the original RM files (found in ProgramFiles/ICP_Base/application/RM_Files) locked in. Even if you change the values in ProgramFiles/ICP_Base/application/RM_Files/XY.csv it will not actually change it in the software. You can copy the original RM_Files folder, store it somewhere that is not the ProgramFiles and then you can change anything you want.</w:t>
+      </w:r>
+    </w:p>
+    <w:p/>
     <w:p>
       <w:pPr>
         <w:jc w:val="both"/>
@@ -3556,39 +3689,6 @@
     <w:p>
       <w:pPr>
         <w:jc w:val="both"/>
-        <w:rPr>
-          <w:b/>
-          <w:bCs/>
-          <w:lang w:val="en-US"/>
-        </w:rPr>
-      </w:pPr>
-      <w:r>
-        <w:rPr>
-          <w:b/>
-          <w:bCs/>
-          <w:lang w:val="en-US"/>
-        </w:rPr>
-        <w:t xml:space="preserve">You can proceed </w:t>
-      </w:r>
-      <w:r>
-        <w:rPr>
-          <w:b/>
-          <w:bCs/>
-          <w:lang w:val="en-US"/>
-        </w:rPr>
-        <w:t xml:space="preserve">to the </w:t>
-      </w:r>
-      <w:r>
-        <w:rPr>
-          <w:b/>
-          <w:bCs/>
-          <w:lang w:val="en-US"/>
-        </w:rPr>
-        <w:t>Drift Module</w:t>
-      </w:r>
-    </w:p>
-    <w:p>
-      <w:pPr>
         <w:rPr>
           <w:rFonts w:asciiTheme="majorHAnsi" w:eastAsiaTheme="majorEastAsia" w:hAnsiTheme="majorHAnsi" w:cstheme="majorBidi"/>
           <w:b/>
@@ -3600,6 +3700,30 @@
       </w:pPr>
       <w:r>
         <w:rPr>
+          <w:b/>
+          <w:bCs/>
+          <w:lang w:val="en-US"/>
+        </w:rPr>
+        <w:t xml:space="preserve">You can proceed </w:t>
+      </w:r>
+      <w:r>
+        <w:rPr>
+          <w:b/>
+          <w:bCs/>
+          <w:lang w:val="en-US"/>
+        </w:rPr>
+        <w:t xml:space="preserve">to the </w:t>
+      </w:r>
+      <w:r>
+        <w:rPr>
+          <w:b/>
+          <w:bCs/>
+          <w:lang w:val="en-US"/>
+        </w:rPr>
+        <w:t>Drift Module</w:t>
+      </w:r>
+      <w:r>
+        <w:rPr>
           <w:lang w:val="en-US"/>
         </w:rPr>
         <w:br w:type="page"/>
@@ -4072,7 +4196,21 @@
         <w:rPr>
           <w:lang w:val="en-US"/>
         </w:rPr>
-        <w:t>(i) a</w:t>
+        <w:t>(</w:t>
+      </w:r>
+      <w:proofErr w:type="spellStart"/>
+      <w:r>
+        <w:rPr>
+          <w:lang w:val="en-US"/>
+        </w:rPr>
+        <w:t>i</w:t>
+      </w:r>
+      <w:proofErr w:type="spellEnd"/>
+      <w:r>
+        <w:rPr>
+          <w:lang w:val="en-US"/>
+        </w:rPr>
+        <w:t>) a</w:t>
       </w:r>
       <w:r>
         <w:rPr>
@@ -4441,6 +4579,33 @@
     </w:p>
     <w:p>
       <w:pPr>
+        <w:pStyle w:val="ListParagraph"/>
+        <w:numPr>
+          <w:ilvl w:val="0"/>
+          <w:numId w:val="11"/>
+        </w:numPr>
+        <w:jc w:val="both"/>
+        <w:rPr>
+          <w:b/>
+          <w:bCs/>
+          <w:sz w:val="16"/>
+          <w:szCs w:val="16"/>
+          <w:lang w:val="en-US"/>
+        </w:rPr>
+      </w:pPr>
+      <w:r>
+        <w:rPr>
+          <w:b/>
+          <w:bCs/>
+          <w:sz w:val="16"/>
+          <w:szCs w:val="16"/>
+          <w:lang w:val="en-US"/>
+        </w:rPr>
+        <w:t>If you want to change the oxides that should be used for quantification and you use a compiled version you have to change the Total Oxide Folder. The compiled version has the original Oxides.xlsx (found in ProgramFiles/ICP_Base/application/Total_Oxide_Calculations) locked in. Even if you change the values in ProgramFiles/ICP_Base/application/Total_Oxide_Calculations/Oxides.xlsx it will not actually change it in the software. You can copy this original Total_Oxide_Calculations folder, store it somewhere that is not the ProgramFiles and then you can change anything you want.</w:t>
+      </w:r>
+    </w:p>
+    <w:p>
+      <w:pPr>
         <w:jc w:val="both"/>
         <w:rPr>
           <w:b/>
@@ -4517,16 +4682,6 @@
         </w:rPr>
         <w:t xml:space="preserve"> Module</w:t>
       </w:r>
-    </w:p>
-    <w:p>
-      <w:pPr>
-        <w:jc w:val="both"/>
-        <w:rPr>
-          <w:b/>
-          <w:bCs/>
-          <w:lang w:val="en-US"/>
-        </w:rPr>
-      </w:pPr>
     </w:p>
     <w:p>
       <w:pPr>
@@ -4564,23 +4719,6 @@
     </w:p>
     <w:p>
       <w:pPr>
-        <w:rPr>
-          <w:i/>
-          <w:iCs/>
-          <w:lang w:val="en-US"/>
-        </w:rPr>
-      </w:pPr>
-      <w:r>
-        <w:rPr>
-          <w:i/>
-          <w:iCs/>
-          <w:lang w:val="en-US"/>
-        </w:rPr>
-        <w:br w:type="page"/>
-      </w:r>
-    </w:p>
-    <w:p>
-      <w:pPr>
         <w:pStyle w:val="Heading1"/>
         <w:jc w:val="both"/>
         <w:rPr>
@@ -4942,7 +5080,21 @@
         <w:rPr>
           <w:lang w:val="en-US"/>
         </w:rPr>
-        <w:t>Ratios the results of a secondary reference material  by its “Real Value” which comes from the reference material file (.csv in RM_Files folder)</w:t>
+        <w:t xml:space="preserve">Ratios the results of a secondary reference material  by its “Real Value” which comes from the reference material file (.csv in </w:t>
+      </w:r>
+      <w:proofErr w:type="spellStart"/>
+      <w:r>
+        <w:rPr>
+          <w:lang w:val="en-US"/>
+        </w:rPr>
+        <w:t>RM_Files</w:t>
+      </w:r>
+      <w:proofErr w:type="spellEnd"/>
+      <w:r>
+        <w:rPr>
+          <w:lang w:val="en-US"/>
+        </w:rPr>
+        <w:t xml:space="preserve"> folder)</w:t>
       </w:r>
     </w:p>
     <w:p>
@@ -7981,6 +8133,30 @@
       <w:lang w:val="en-GB"/>
     </w:rPr>
   </w:style>
+  <w:style w:type="character" w:customStyle="1" w:styleId="s8a3f8c5831">
+    <w:name w:val="s8a3f8c5831"/>
+    <w:basedOn w:val="DefaultParagraphFont"/>
+    <w:rsid w:val="00F87C7A"/>
+    <w:rPr>
+      <w:strike w:val="0"/>
+      <w:dstrike w:val="0"/>
+      <w:color w:val="FFFFFF"/>
+      <w:u w:val="none"/>
+      <w:effect w:val="none"/>
+    </w:rPr>
+  </w:style>
+  <w:style w:type="character" w:customStyle="1" w:styleId="sb1ae341231">
+    <w:name w:val="sb1ae341231"/>
+    <w:basedOn w:val="DefaultParagraphFont"/>
+    <w:rsid w:val="007B4D69"/>
+    <w:rPr>
+      <w:strike w:val="0"/>
+      <w:dstrike w:val="0"/>
+      <w:color w:val="FFFFFF"/>
+      <w:u w:val="none"/>
+      <w:effect w:val="none"/>
+    </w:rPr>
+  </w:style>
 </w:styles>
 </file>
 

</xml_diff>